<commit_message>
Paper: fix dangling §5.4-5.10 cross-refs in §3 Setup (restructure leftovers) -> §5.3/§6; regen docx
</commit_message>
<xml_diff>
--- a/docx/cvgip2026_paper.docx
+++ b/docx/cvgip2026_paper.docx
@@ -1100,7 +1100,7 @@
     </w:p>
     <w:p>
       <w:r>
-        <w:t>in no-think and think modes. Cross-family peers (§5.3): InternVL, Phi-3.5-V. Verifier base (§5.10):</w:t>
+        <w:t>in no-think and think modes. Cross-family peers (§5.3): InternVL, Phi-3.5-V. Verifier base (§6):</w:t>
       </w:r>
     </w:p>
     <w:p>
@@ -1164,12 +1164,12 @@
     </w:p>
     <w:p>
       <w:r>
-        <w:t>Open-ended (§5.7–§5.10): free-text SLAKE/VQA-RAD/PathVQA/Kvasir-VQA-x1, + RadImageNet-VQA (transfer), graded</w:t>
+        <w:t>Open-ended (§5.3, §6): free-text SLAKE/VQA-RAD/PathVQA/Kvasir-VQA-x1, + RadImageNet-VQA (transfer), graded</w:t>
       </w:r>
     </w:p>
     <w:p>
       <w:r>
-        <w:t xml:space="preserve">by a neutral LLM judge. Grounding (§5.10): SLAKE organ boxes and the real </w:t>
+        <w:t xml:space="preserve">by a neutral LLM judge. Grounding (§6.2): SLAKE organ boxes and the real </w:t>
       </w:r>
       <w:r>
         <w:rPr>
@@ -2910,7 +2910,7 @@
         <w:rPr>
           <w:b/>
         </w:rPr>
-        <w:t>Generalizes across families/architectures (§5.5).</w:t>
+        <w:t>Generalizes across families/architectures.</w:t>
       </w:r>
       <w:r>
         <w:t xml:space="preserve"> The "no-think ≥ think on perception" premise and the</w:t>

</xml_diff>

<commit_message>
Real same-split results + correction: verifier 0.501 > 32B 0.462 (fair); fix per-dataset claim
- Reconstructed clean_dump from saved scores (validated 1064/1064, 0 mismatch) -> killed redundant slow
  re-score. Real same-split table (n=1064): greedy 0.413, SC 0.411 (BELOW greedy = majority trap), 32B 0.462,
  verifier 0.501, oracle 0.592.
- CORRECTION: per-dataset verifier-vs-32B (same split) — verifier wins PathVQA (0.441>0.377) + Kvasir
  (0.405>0.326), 32B wins SLAKE (0.829) + VQA-RAD (0.648). (Earlier 'wins VQA-RAD' was a full-set artifact.)
- Verifier-augmented cascade integration: 0.517 @ 35% escalation (accuracy-optimal).
- Propagated to report (rebuilt, figures regenerated w/ canonical numbers), paper .md + .tex (recompiled PDF)
  + docx; VERIFIED_FACTS §F. Cross-gen (multi-model) transfer landing: SLAKE 0.543->0.620.

Co-Authored-By: Claude Opus 4.8 <noreply@anthropic.com>
Claude-Session: https://claude.ai/code/session_01Q8J4SpG8WQbTwXXZJxqG8U
</commit_message>
<xml_diff>
--- a/docx/cvgip2026_paper.docx
+++ b/docx/cvgip2026_paper.docx
@@ -410,7 +410,7 @@
         <w:rPr>
           <w:b/>
         </w:rPr>
-        <w:t>a 7B with the verifier (0.501) beats the 32B's single pass (0.444)</w:t>
+        <w:t>a 7B with the verifier (0.501) beats the 32B's single pass (0.462, same held-out split)</w:t>
       </w:r>
       <w:r>
         <w:t>: test-time compute</w:t>
@@ -3055,12 +3055,36 @@
         <w:t>φ = 0.372</w:t>
       </w:r>
       <w:r>
-        <w:t xml:space="preserve"> — the models fail together. Holding ACC's config fixed,</w:t>
-      </w:r>
-    </w:p>
-    <w:p>
-      <w:r>
-        <w:t>every gate lands on one frontier (§5.1), so no gate is "better."</w:t>
+        <w:t xml:space="preserve"> (φ = the correlation of the two models' right/wrong</w:t>
+      </w:r>
+    </w:p>
+    <w:p>
+      <w:r>
+        <w:t>outcomes) — the models fail together. Holding ACC's config fixed, every gate lands on one frontier (§5.1),</w:t>
+      </w:r>
+    </w:p>
+    <w:p>
+      <w:r>
+        <w:t>so no gate is "better." This matches theory: Jitkrittum et al. (*When does confidence-based cascade deferral</w:t>
+      </w:r>
+    </w:p>
+    <w:p>
+      <w:r>
+        <w:t>suffice?</w:t>
+      </w:r>
+      <w:r>
+        <w:rPr>
+          <w:i/>
+        </w:rPr>
+        <w:t xml:space="preserve">, NeurIPS 2023) prove the optimal deferral rule needs </w:t>
+      </w:r>
+      <w:r>
+        <w:t>both* models' confidence and that</w:t>
+      </w:r>
+    </w:p>
+    <w:p>
+      <w:r>
+        <w:t>confidence-only deferral is fundamentally limited — exactly the wall we hit empirically on medical VLMs.</w:t>
       </w:r>
     </w:p>
     <w:p>
@@ -3518,6 +3542,71 @@
       </w:r>
       <w:r>
         <w:t xml:space="preserve"> structured boxes.</w:t>
+      </w:r>
+    </w:p>
+    <w:p>
+      <w:r>
+        <w:rPr>
+          <w:i/>
+        </w:rPr>
+      </w:r>
+      <w:r>
+        <w:rPr>
+          <w:i/>
+        </w:rPr>
+        <w:t xml:space="preserve">Why a trained verifier matters </w:t>
+      </w:r>
+      <w:r>
+        <w:t>here</w:t>
+      </w:r>
+      <w:r>
+        <w:rPr>
+          <w:i/>
+        </w:rPr>
+        <w:t xml:space="preserve"> specifically.</w:t>
+      </w:r>
+      <w:r>
+        <w:rPr>
+          <w:i/>
+        </w:rPr>
+        <w:t xml:space="preserve"> In </w:t>
+      </w:r>
+      <w:r>
+        <w:t>general* LLM reasoning, trained-verifier</w:t>
+      </w:r>
+    </w:p>
+    <w:p>
+      <w:r>
+        <w:t>best-of-N barely beats plain self-consistency — recent work reports near-parity (e.g. self-certainty</w:t>
+      </w:r>
+    </w:p>
+    <w:p>
+      <w:r>
+        <w:t>best-of-N, NeurIPS 2025 [2502.18581]; aggregation studies [2510.13918]) — so a learned verifier is often</w:t>
+      </w:r>
+    </w:p>
+    <w:p>
+      <w:r>
+        <w:t xml:space="preserve">seen as not worth its cost. Medical open-ended VQA is the opposite regime: self-consistency </w:t>
+      </w:r>
+      <w:r>
+        <w:rPr>
+          <w:i/>
+        </w:rPr>
+        <w:t>fails</w:t>
+      </w:r>
+      <w:r>
+        <w:t xml:space="preserve"> (the</w:t>
+      </w:r>
+    </w:p>
+    <w:p>
+      <w:r>
+        <w:t>majority trap, §5.2e), the strong model barely helps (§5.1), yet the oracle headroom is large. That is</w:t>
+      </w:r>
+    </w:p>
+    <w:p>
+      <w:r>
+        <w:t>exactly where a learned selector should pay off — and it does.</w:t>
       </w:r>
     </w:p>
     <w:p>
@@ -5101,10 +5190,10 @@
         <w:rPr>
           <w:b/>
         </w:rPr>
-        <w:t>0.444</w:t>
-      </w:r>
-      <w:r>
-        <w:t xml:space="preserve"> pooled — </w:t>
+        <w:t>0.462</w:t>
+      </w:r>
+      <w:r>
+        <w:t xml:space="preserve"> (same held-out split) pooled — </w:t>
       </w:r>
       <w:r>
         <w:rPr>
@@ -5132,12 +5221,12 @@
     </w:p>
     <w:p>
       <w:r>
-        <w:t>fails — VQA-RAD 0.611 vs 0.600, PathVQA 0.441 vs 0.376, Kvasir 0.405 vs 0.301 — and loses only on SLAKE</w:t>
-      </w:r>
-    </w:p>
-    <w:p>
-      <w:r>
-        <w:t>(0.762 vs 0.819), the one set where the 32B is genuinely the stronger model</w:t>
+        <w:t>fails — PathVQA 0.441 vs 0.377 and Kvasir 0.405 vs 0.326 (the two hardest sets) — and loses on the two where</w:t>
+      </w:r>
+    </w:p>
+    <w:p>
+      <w:r>
+        <w:t>the 32B is genuinely stronger, SLAKE (0.762 vs 0.829) and VQA-RAD (0.611 vs 0.648)</w:t>
       </w:r>
     </w:p>
     <w:p>
@@ -5309,26 +5398,101 @@
         <w:t>Honest scope.</w:t>
       </w:r>
       <w:r>
-        <w:t xml:space="preserve"> ACC parity is on the competent benchmarks (MMMU/MedXpert excluded as near-chance for both</w:t>
-      </w:r>
-    </w:p>
-    <w:p>
-      <w:r>
-        <w:t xml:space="preserve">models). The verifier lifts </w:t>
+        <w:t xml:space="preserve"> The ACC over-thinking premise (no-think ≥ think) holds on the </w:t>
       </w:r>
       <w:r>
         <w:rPr>
           <w:i/>
         </w:rPr>
-        <w:t>selection over a frozen generator</w:t>
-      </w:r>
-      <w:r>
-        <w:t>; it does not beat a trained SOTA grounder in</w:t>
-      </w:r>
-    </w:p>
-    <w:p>
-      <w:r>
-        <w:t>absolute IoU. Latency/energy are calibrated batch-1 (Eq. 1), not a single end-to-end wall-clock; FLOPs are</w:t>
+        <w:t>perception</w:t>
+      </w:r>
+      <w:r>
+        <w:t xml:space="preserve"> benchmarks</w:t>
+      </w:r>
+    </w:p>
+    <w:p>
+      <w:r>
+        <w:t xml:space="preserve">(COMPETENT-4: SLAKE/VQA-RAD/PathVQA/PMC). </w:t>
+      </w:r>
+      <w:r>
+        <w:rPr>
+          <w:b/>
+        </w:rPr>
+        <w:t>MMMU-medical is competent (32B-think 0.688), not near-chance</w:t>
+      </w:r>
+      <w:r>
+        <w:t xml:space="preserve"> —</w:t>
+      </w:r>
+    </w:p>
+    <w:p>
+      <w:r>
+        <w:t xml:space="preserve">but it is a </w:t>
+      </w:r>
+      <w:r>
+        <w:rPr>
+          <w:i/>
+        </w:rPr>
+        <w:t>reasoning</w:t>
+      </w:r>
+      <w:r>
+        <w:t xml:space="preserve"> benchmark where thinking helps (no-think 0.624 &lt; think 0.688), so the over-thinking</w:t>
+      </w:r>
+    </w:p>
+    <w:p>
+      <w:r>
+        <w:t xml:space="preserve">mechanism does not apply to it; </w:t>
+      </w:r>
+      <w:r>
+        <w:rPr>
+          <w:b/>
+        </w:rPr>
+        <w:t>MedXpert-MM is the genuinely near-chance set</w:t>
+      </w:r>
+      <w:r>
+        <w:t xml:space="preserve"> (7B at/below the 4-option</w:t>
+      </w:r>
+    </w:p>
+    <w:p>
+      <w:r>
+        <w:t>chance level, 0.23–0.26) and is excluded from headline efficiency claims. Both still appear in the full ALL-6</w:t>
+      </w:r>
+    </w:p>
+    <w:p>
+      <w:r>
+        <w:t xml:space="preserve">tables. The verifier (open-ended) is evaluated on the datasets that </w:t>
+      </w:r>
+      <w:r>
+        <w:rPr>
+          <w:i/>
+        </w:rPr>
+        <w:t>have</w:t>
+      </w:r>
+      <w:r>
+        <w:t xml:space="preserve"> free-text answers — SLAKE,</w:t>
+      </w:r>
+    </w:p>
+    <w:p>
+      <w:r>
+        <w:t>VQA-RAD, PathVQA (the core three), plus Kvasir (OOD) and RadImageNet (transfer); PMC-VQA and MMMU are</w:t>
+      </w:r>
+    </w:p>
+    <w:p>
+      <w:r>
+        <w:t xml:space="preserve">MCQ-only, so they are absent by </w:t>
+      </w:r>
+      <w:r>
+        <w:rPr>
+          <w:i/>
+        </w:rPr>
+        <w:t>format</w:t>
+      </w:r>
+      <w:r>
+        <w:t>, not by selection. The verifier lifts *selection over a frozen</w:t>
+      </w:r>
+    </w:p>
+    <w:p>
+      <w:r>
+        <w:t>generator*; it does not beat a trained SOTA grounder in absolute IoU. Latency/energy are calibrated batch-1 (Eq. 1), not a single end-to-end wall-clock; FLOPs are</w:t>
       </w:r>
     </w:p>
     <w:p>

</xml_diff>

<commit_message>
Address: verifier base/training-data/non-circularity questions
- Report S10 + paper §6/.tex: what the LoRA trains on (~6k examples, 70% train split of SLAKE/VQA-RAD/
  PathVQA/Kvasir, candidates=7B's own samples, RadImageNet held out); why not circular (judge=grader vs
  gold, verifier=discrimination not generation, supervised-small vs zero-shot-big); why Lingshu base
  (path-dependent, the open-ended generator).
- Report: box-verifier DATA TABLE (was bars-only), ALL-5 numbers, glossary (perception/capacity/IoU/latent-
  knowledge/CASP), peers explained + SOTA named (S4), FLOPs-vs-latency explanation (prefill-parallel vs
  decode-serial), cross-gen both datasets.
- Launched MedVLThinker-7B verifier (other-base, full method) — parameterized run_lora_verifier_open (VERIF_CK/TAG).

Co-Authored-By: Claude Opus 4.8 <noreply@anthropic.com>
Claude-Session: https://claude.ai/code/session_01Q8J4SpG8WQbTwXXZJxqG8U
</commit_message>
<xml_diff>
--- a/docx/cvgip2026_paper.docx
+++ b/docx/cvgip2026_paper.docx
@@ -3722,6 +3722,161 @@
       </w:r>
     </w:p>
     <w:p>
+      <w:r>
+        <w:rPr>
+          <w:b/>
+        </w:rPr>
+        <w:t>Why a 32B-judged 7B verifier beating the 32B is not circular.</w:t>
+      </w:r>
+      <w:r>
+        <w:t xml:space="preserve"> The LLM judge is an </w:t>
+      </w:r>
+      <w:r>
+        <w:rPr>
+          <w:i/>
+        </w:rPr>
+        <w:t>automated grader</w:t>
+      </w:r>
+      <w:r>
+        <w:t>,</w:t>
+      </w:r>
+    </w:p>
+    <w:p>
+      <w:r>
+        <w:t xml:space="preserve">not a knowledge oracle: its sole job is deciding whether a free-text answer matches the </w:t>
+      </w:r>
+      <w:r>
+        <w:rPr>
+          <w:b/>
+        </w:rPr>
+        <w:t>gold</w:t>
+      </w:r>
+      <w:r>
+        <w:t xml:space="preserve"> answer</w:t>
+      </w:r>
+    </w:p>
+    <w:p>
+      <w:r>
+        <w:t xml:space="preserve">(a semantic substitute for exact-match, which is too brittle for free text). The labels </w:t>
+      </w:r>
+      <w:r>
+        <w:rPr>
+          <w:rFonts w:ascii="Consolas" w:hAnsi="Consolas"/>
+          <w:color w:val="B03060"/>
+          <w:sz w:val="19"/>
+        </w:rPr>
+        <w:t>y</w:t>
+      </w:r>
+      <w:r>
+        <w:t xml:space="preserve"> therefore derive</w:t>
+      </w:r>
+    </w:p>
+    <w:p>
+      <w:r>
+        <w:t xml:space="preserve">from the dataset </w:t>
+      </w:r>
+      <w:r>
+        <w:rPr>
+          <w:b/>
+        </w:rPr>
+        <w:t>answer key</w:t>
+      </w:r>
+      <w:r>
+        <w:t>, not from the 32B's medical knowledge — the grader could be a human or</w:t>
+      </w:r>
+    </w:p>
+    <w:p>
+      <w:r>
+        <w:t xml:space="preserve">exact-match. The verifier (a frozen 7B + LoRA) is trained only on the </w:t>
+      </w:r>
+      <w:r>
+        <w:rPr>
+          <w:b/>
+        </w:rPr>
+        <w:t>7B's own samples</w:t>
+      </w:r>
+      <w:r>
+        <w:t xml:space="preserve"> and learns to</w:t>
+      </w:r>
+    </w:p>
+    <w:p>
+      <w:r>
+        <w:rPr>
+          <w:i/>
+        </w:rPr>
+        <w:t>discriminate</w:t>
+      </w:r>
+      <w:r>
+        <w:t xml:space="preserve"> correct answers, a strictly easier task than </w:t>
+      </w:r>
+      <w:r>
+        <w:rPr>
+          <w:i/>
+        </w:rPr>
+        <w:t>generating</w:t>
+      </w:r>
+      <w:r>
+        <w:t xml:space="preserve"> them: the 7B's N samples already</w:t>
+      </w:r>
+    </w:p>
+    <w:p>
+      <w:r>
+        <w:t>contain a correct answer in 59% of pooled cases (the oracle), so the verifier need only identify it — which</w:t>
+      </w:r>
+    </w:p>
+    <w:p>
+      <w:r>
+        <w:t xml:space="preserve">is why a </w:t>
+      </w:r>
+      <w:r>
+        <w:rPr>
+          <w:i/>
+        </w:rPr>
+        <w:t>7B</w:t>
+      </w:r>
+      <w:r>
+        <w:t xml:space="preserve"> selector suffices and imports no 32B capability. The comparison is thus between two deployment</w:t>
+      </w:r>
+    </w:p>
+    <w:p>
+      <w:r>
+        <w:t xml:space="preserve">strategies — scaling to a 5× model </w:t>
+      </w:r>
+      <w:r>
+        <w:rPr>
+          <w:i/>
+        </w:rPr>
+        <w:t>zero-shot</w:t>
+      </w:r>
+      <w:r>
+        <w:t xml:space="preserve"> vs. sampling a small model + a small </w:t>
+      </w:r>
+      <w:r>
+        <w:rPr>
+          <w:i/>
+        </w:rPr>
+        <w:t>supervised</w:t>
+      </w:r>
+      <w:r>
+        <w:t xml:space="preserve"> verifier —</w:t>
+      </w:r>
+    </w:p>
+    <w:p>
+      <w:r>
+        <w:t>and the latter wins; the in-domain supervision (a few thousand gold labels) is precisely the contribution</w:t>
+      </w:r>
+    </w:p>
+    <w:p>
+      <w:r>
+        <w:t>(and its cost). AUROC 0.924 and the −0.047 image-ablation confirm the verifier learned genuine visual</w:t>
+      </w:r>
+    </w:p>
+    <w:p>
+      <w:r>
+        <w:t>discrimination, not judge-mimicry (the judge needs the gold answer; the verifier does not).</w:t>
+      </w:r>
+    </w:p>
+    <w:p>
       <w:pPr>
         <w:pStyle w:val="Heading3"/>
       </w:pPr>

</xml_diff>

<commit_message>
Gap-fill + iteration: verifier-vs-32B bootstrap CI [+0.010,+0.066] (significant); argmax > weighted-voting
- Filled the headline-rigor gap: paired bootstrap on (verifier - 32B) = +0.039 [+0.010,+0.066], excludes 0.
- Method iteration: verifier-argmax (0.501) beats verifier-weighted-vote (0.489) and score×count hybrid
  (0.470) -- the majority trap contaminates even score-weighted voting, so pure argmax is the rule.
- Propagated to report S12 + paper §6 (.md/.tex/PDF) + docx; VERIFIED_FACTS §G. MedVLThinker-7B other-base verifier training.

Co-Authored-By: Claude Opus 4.8 <noreply@anthropic.com>
Claude-Session: https://claude.ai/code/session_01Q8J4SpG8WQbTwXXZJxqG8U
</commit_message>
<xml_diff>
--- a/docx/cvgip2026_paper.docx
+++ b/docx/cvgip2026_paper.docx
@@ -4589,7 +4589,61 @@
         <w:t>+0.116, 95% CI [+0.092, +0.139]</w:t>
       </w:r>
       <w:r>
-        <w:t xml:space="preserve"> (n=1064, excludes 0).</w:t>
+        <w:t xml:space="preserve"> (n=1064, excludes 0); and over the </w:t>
+      </w:r>
+      <w:r>
+        <w:rPr>
+          <w:b/>
+        </w:rPr>
+        <w:t>32B itself</w:t>
+      </w:r>
+      <w:r>
+        <w:t>, +0.039, 95% CI</w:t>
+      </w:r>
+    </w:p>
+    <w:p>
+      <w:r>
+        <w:rPr>
+          <w:b/>
+        </w:rPr>
+        <w:t>[+0.010, +0.066]</w:t>
+      </w:r>
+      <w:r>
+        <w:t xml:space="preserve"> — a modest but significant win over the 5× model. *Argmax is the correct selection</w:t>
+      </w:r>
+    </w:p>
+    <w:p>
+      <w:r>
+        <w:t>rule:</w:t>
+      </w:r>
+      <w:r>
+        <w:rPr>
+          <w:i/>
+        </w:rPr>
+        <w:t xml:space="preserve"> verifier-</w:t>
+      </w:r>
+      <w:r>
+        <w:t>weighted</w:t>
+      </w:r>
+      <w:r>
+        <w:rPr>
+          <w:i/>
+        </w:rPr>
+        <w:t xml:space="preserve"> voting (0.489) and a score×count hybrid (0.470) are both </w:t>
+      </w:r>
+      <w:r>
+        <w:rPr>
+          <w:i/>
+        </w:rPr>
+        <w:t>worse</w:t>
+      </w:r>
+      <w:r>
+        <w:t>* than plain</w:t>
+      </w:r>
+    </w:p>
+    <w:p>
+      <w:r>
+        <w:t>argmax (0.501), because the majority trap (§5.2e) contaminates even score-weighted voting.</w:t>
       </w:r>
     </w:p>
     <w:p>

</xml_diff>

<commit_message>
Honesty: self-certainty marked not-run (training-free, expected luck-floored); small-n caution on per-dataset (VQA-RAD n=54)
</commit_message>
<xml_diff>
--- a/docx/cvgip2026_paper.docx
+++ b/docx/cvgip2026_paper.docx
@@ -5435,7 +5435,12 @@
     </w:p>
     <w:p>
       <w:r>
-        <w:t>the 32B is genuinely stronger, SLAKE (0.762 vs 0.829) and VQA-RAD (0.611 vs 0.648)</w:t>
+        <w:t>the 32B is genuinely stronger, SLAKE (0.762 vs 0.829) and VQA-RAD (0.611 vs 0.648; per-dataset n are small —</w:t>
+      </w:r>
+    </w:p>
+    <w:p>
+      <w:r>
+        <w:t>VQA-RAD n=54 — so per-dataset signs are directional, the pooled n=1064 win is the solid claim)</w:t>
       </w:r>
     </w:p>
     <w:p>

</xml_diff>

<commit_message>
Multi-model (other-base) verifier result, reported honestly
MedVLThinker-7B verifier (full method from scratch): SLAKE 0.564->0.622 (42%), pooled 0.547->0.583 (25%),
but VQA-RAD fails (n=54: 0.500->0.470). => method transfers to a 2nd base but not uniformly; base quality
matters (Lingshu verifier's transfer 49-61% > from-scratch MedVLThinker 25%). Lingshu (49%, 4 ds, 2-seed)
stays the validated headline. Folded into report S13 + paper §6.1 (.md/.tex/PDF) + docx + VERIFIED_FACTS §H.

Co-Authored-By: Claude Opus 4.8 <noreply@anthropic.com>
Claude-Session: https://claude.ai/code/session_01Q8J4SpG8WQbTwXXZJxqG8U
</commit_message>
<xml_diff>
--- a/docx/cvgip2026_paper.docx
+++ b/docx/cvgip2026_paper.docx
@@ -4749,40 +4749,109 @@
         <w:rPr>
           <w:b/>
         </w:rPr>
-        <w:t>Generalizes.</w:t>
-      </w:r>
-      <w:r>
-        <w:t xml:space="preserve"> The pooled-4 verifier transfers </w:t>
+        <w:t>Generalizes (datasets, modality, and across generators).</w:t>
+      </w:r>
+      <w:r>
+        <w:t xml:space="preserve"> The pooled-4 verifier transfers **zero-shot to a</w:t>
+      </w:r>
+    </w:p>
+    <w:p>
+      <w:r>
+        <w:t>fifth, held-out** dataset (RadImageNet-VQA: 0.329 → 0.353, +0.024, 13% of its gap) and across modality</w:t>
+      </w:r>
+    </w:p>
+    <w:p>
+      <w:r>
+        <w:t xml:space="preserve">(Kvasir-OOD). </w:t>
       </w:r>
       <w:r>
         <w:rPr>
           <w:b/>
         </w:rPr>
-        <w:t>zero-shot to a fifth, held-out</w:t>
-      </w:r>
-      <w:r>
-        <w:t xml:space="preserve"> dataset</w:t>
-      </w:r>
-    </w:p>
-    <w:p>
-      <w:r>
-        <w:t xml:space="preserve">(RadImageNet-VQA: 0.329 → 0.353, +0.024, 13% of its gap) and across modality (Kvasir-OOD). </w:t>
+        <w:t>Across generator models:</w:t>
+      </w:r>
+      <w:r>
+        <w:t xml:space="preserve"> applied to a </w:t>
+      </w:r>
+      <w:r>
+        <w:rPr>
+          <w:i/>
+        </w:rPr>
+        <w:t>different</w:t>
+      </w:r>
+      <w:r>
+        <w:t xml:space="preserve"> model's answers (MedVLThinker-7B), the</w:t>
+      </w:r>
+    </w:p>
+    <w:p>
+      <w:r>
+        <w:t>Lingshu-trained verifier still lifts SLAKE 0.543 → 0.620 (49%) and VQA-RAD 0.395 → 0.520 (61%) — it is</w:t>
+      </w:r>
+    </w:p>
+    <w:p>
+      <w:r>
+        <w:t xml:space="preserve">largely generator-agnostic. </w:t>
       </w:r>
       <w:r>
         <w:rPr>
           <w:b/>
         </w:rPr>
+        <w:t>Across base models (honest, mixed):</w:t>
+      </w:r>
+      <w:r>
+        <w:t xml:space="preserve"> trained </w:t>
+      </w:r>
+      <w:r>
+        <w:rPr>
+          <w:i/>
+        </w:rPr>
+        <w:t>from scratch</w:t>
+      </w:r>
+      <w:r>
+        <w:t xml:space="preserve"> on a MedVLThinker-7B</w:t>
+      </w:r>
+    </w:p>
+    <w:p>
+      <w:r>
+        <w:t xml:space="preserve">base it works on SLAKE (0.564 → 0.622, 42%) and is pooled-positive (25%) but </w:t>
+      </w:r>
+      <w:r>
+        <w:rPr>
+          <w:i/>
+        </w:rPr>
+        <w:t>fails</w:t>
+      </w:r>
+      <w:r>
+        <w:t xml:space="preserve"> on VQA-RAD's tiny split</w:t>
+      </w:r>
+    </w:p>
+    <w:p>
+      <w:r>
+        <w:t>(n=54: 0.500 → 0.470) — so the method is not uniformly robust across bases, and a stronger base (Lingshu) makes</w:t>
+      </w:r>
+    </w:p>
+    <w:p>
+      <w:r>
+        <w:t>a stronger verifier (its transfer 49–61% exceeds a from-scratch MedVLThinker verifier's 25%); the Lingshu</w:t>
+      </w:r>
+    </w:p>
+    <w:p>
+      <w:r>
+        <w:t xml:space="preserve">result (49%, four datasets, two seeds) is the validated headline. </w:t>
+      </w:r>
+      <w:r>
+        <w:rPr>
+          <w:b/>
+        </w:rPr>
         <w:t>Data-efficient:</w:t>
       </w:r>
-    </w:p>
-    <w:p>
-      <w:r>
-        <w:t>it needs only ${\sim}6{,}000$ judge</w:t>
-      </w:r>
-    </w:p>
-    <w:p>
-      <w:r>
-        <w:t>labels in total to reach this lift.</w:t>
+      <w:r>
+        <w:t xml:space="preserve"> it needs only</w:t>
+      </w:r>
+    </w:p>
+    <w:p>
+      <w:r>
+        <w:t>${\sim}6{,}000$ judge labels in total to reach this lift.</w:t>
       </w:r>
     </w:p>
     <w:p>

</xml_diff>

<commit_message>
Finalize honest reframe: 35-78%/35-49% ranges, overview header, memory correction (PHASE 8)
</commit_message>
<xml_diff>
--- a/docx/cvgip2026_paper.docx
+++ b/docx/cvgip2026_paper.docx
@@ -724,7 +724,7 @@
     </w:p>
     <w:p>
       <w:r>
-        <w:t>40–78% of the oracle gap for both answers and boxes, where every training-free selector is luck-floored.</w:t>
+        <w:t>35–78% of the oracle gap for both answers and boxes, where every training-free selector is luck-floored.</w:t>
       </w:r>
     </w:p>
     <w:p>
@@ -5261,7 +5261,7 @@
     </w:p>
     <w:p>
       <w:r>
-        <w:t xml:space="preserve">recovers 40–78% of the oracle gap, 2-seed-robust. On the real </w:t>
+        <w:t xml:space="preserve">recovers 35–78% of the oracle gap, 2-seed-robust. On the real </w:t>
       </w:r>
       <w:r>
         <w:rPr>
@@ -5848,7 +5848,7 @@
     </w:p>
     <w:p>
       <w:r>
-        <w:t>exact. The free-text per-dataset spread is wide (SLAKE 15% — little headroom — to Kvasir 58%); the 40–78%</w:t>
+        <w:t>exact. The free-text per-dataset spread is wide (SLAKE 15% — little headroom — to Kvasir 58%); the 35–78%</w:t>
       </w:r>
     </w:p>
     <w:p>
@@ -5971,7 +5971,7 @@
     </w:p>
     <w:p>
       <w:r>
-        <w:t>40–78% of the oracle gap for both answers and bounding boxes (incl. a real chest-X-ray benchmark), behaving</w:t>
+        <w:t>35–78% of the oracle gap for both answers and bounding boxes (incl. a real chest-X-ray benchmark), behaving</w:t>
       </w:r>
     </w:p>
     <w:p>

</xml_diff>